<commit_message>
feat: support exact Knowledge version resolution
Introduce stable Knowledge lineage identity and exact version IDs.

Isolate confidence, relationships, and consumption by version.

Add KnowledgeConsumptionAccess.resolve and migrate Strategy Evaluation.
</commit_message>
<xml_diff>
--- a/docs/DOC-003 Filosofía de Inversión y Modelo de Decisión.docx
+++ b/docs/DOC-003 Filosofía de Inversión y Modelo de Decisión.docx
@@ -15,7 +15,7 @@
           <w:szCs w:val="46"/>
         </w:rPr>
       </w:pPr>
-      <w:bookmarkStart w:colFirst="0" w:colLast="0" w:name="_bdnpyggg7iiy" w:id="0"/>
+      <w:bookmarkStart w:colFirst="0" w:colLast="0" w:name="_94a344uytjna" w:id="0"/>
       <w:bookmarkEnd w:id="0"/>
       <w:r>
         <w:rPr>
@@ -25,7 +25,60 @@
           <w:szCs w:val="46"/>
           <w:rtl w:val="0"/>
         </w:rPr>
-        <w:t xml:space="preserve">TramitaGO Quant Platform</w:t>
+        <w:t xml:space="preserve">DOC-003</w:t>
+      </w:r>
+    </w:p>
+    <w:p>
+      <w:pPr>
+        <w:pStyle w:val="Heading2"/>
+        <w:keepNext w:val="0"/>
+        <w:keepLines w:val="0"/>
+        <w:spacing w:after="80" w:lineRule="auto"/>
+        <w:rPr>
+          <w:b w:val="1"/>
+          <w:bCs w:val="1"/>
+          <w:sz w:val="34"/>
+          <w:szCs w:val="34"/>
+        </w:rPr>
+      </w:pPr>
+      <w:bookmarkStart w:colFirst="0" w:colLast="0" w:name="_4349f4jouq4k" w:id="1"/>
+      <w:bookmarkEnd w:id="1"/>
+      <w:r>
+        <w:rPr>
+          <w:b w:val="1"/>
+          <w:bCs w:val="1"/>
+          <w:sz w:val="34"/>
+          <w:szCs w:val="34"/>
+          <w:rtl w:val="0"/>
+        </w:rPr>
+        <w:t xml:space="preserve">Filosofía de Inversión y Modelo de Decisión</w:t>
+      </w:r>
+    </w:p>
+    <w:p>
+      <w:pPr>
+        <w:spacing w:after="240" w:before="240" w:lineRule="auto"/>
+        <w:rPr/>
+      </w:pPr>
+      <w:r>
+        <w:rPr>
+          <w:rtl w:val="0"/>
+        </w:rPr>
+        <w:t xml:space="preserve">Versión 0.1</w:t>
+      </w:r>
+    </w:p>
+    <w:p>
+      <w:pPr>
+        <w:rPr/>
+      </w:pPr>
+      <w:r>
+        <w:pict>
+          <v:rect style="width:0.0pt;height:1.5pt" o:hr="t" o:hrstd="t" o:hralign="center" fillcolor="#A0A0A0" stroked="f"/>
+        </w:pict>
+      </w:r>
+      <w:r>
+        <w:rPr>
+          <w:rtl w:val="0"/>
+        </w:rPr>
       </w:r>
     </w:p>
     <w:p>
@@ -41,55 +94,79 @@
           <w:szCs w:val="46"/>
         </w:rPr>
       </w:pPr>
-      <w:bookmarkStart w:colFirst="0" w:colLast="0" w:name="_94a344uytjna" w:id="1"/>
-      <w:bookmarkEnd w:id="1"/>
-      <w:r>
-        <w:rPr>
-          <w:b w:val="1"/>
-          <w:bCs w:val="1"/>
-          <w:sz w:val="46"/>
-          <w:szCs w:val="46"/>
-          <w:rtl w:val="0"/>
-        </w:rPr>
-        <w:t xml:space="preserve">Documento 003</w:t>
-      </w:r>
-    </w:p>
-    <w:p>
-      <w:pPr>
-        <w:pStyle w:val="Heading2"/>
-        <w:keepNext w:val="0"/>
-        <w:keepLines w:val="0"/>
-        <w:spacing w:after="80" w:lineRule="auto"/>
-        <w:rPr>
-          <w:b w:val="1"/>
-          <w:bCs w:val="1"/>
-          <w:sz w:val="34"/>
-          <w:szCs w:val="34"/>
-        </w:rPr>
-      </w:pPr>
-      <w:bookmarkStart w:colFirst="0" w:colLast="0" w:name="_4349f4jouq4k" w:id="2"/>
+      <w:bookmarkStart w:colFirst="0" w:colLast="0" w:name="_kxzf1zhvngjs" w:id="2"/>
       <w:bookmarkEnd w:id="2"/>
       <w:r>
         <w:rPr>
           <w:b w:val="1"/>
           <w:bCs w:val="1"/>
-          <w:sz w:val="34"/>
-          <w:szCs w:val="34"/>
-          <w:rtl w:val="0"/>
-        </w:rPr>
-        <w:t xml:space="preserve">Filosofía de Inversión y Modelo de Decisión</w:t>
-      </w:r>
-    </w:p>
-    <w:p>
-      <w:pPr>
-        <w:spacing w:after="240" w:before="240" w:lineRule="auto"/>
-        <w:rPr/>
-      </w:pPr>
-      <w:r>
-        <w:rPr>
-          <w:rtl w:val="0"/>
-        </w:rPr>
-        <w:t xml:space="preserve">Versión 0.1</w:t>
+          <w:sz w:val="46"/>
+          <w:szCs w:val="46"/>
+          <w:rtl w:val="0"/>
+        </w:rPr>
+        <w:t xml:space="preserve">1. Propósito</w:t>
+      </w:r>
+    </w:p>
+    <w:p>
+      <w:pPr>
+        <w:spacing w:after="240" w:before="240" w:lineRule="auto"/>
+        <w:rPr/>
+      </w:pPr>
+      <w:r>
+        <w:rPr>
+          <w:rtl w:val="0"/>
+        </w:rPr>
+        <w:t xml:space="preserve">Este documento define la filosofía bajo la cual el sistema evaluará oportunidades de inversión.</w:t>
+      </w:r>
+    </w:p>
+    <w:p>
+      <w:pPr>
+        <w:spacing w:after="240" w:before="240" w:lineRule="auto"/>
+        <w:rPr/>
+      </w:pPr>
+      <w:r>
+        <w:rPr>
+          <w:rtl w:val="0"/>
+        </w:rPr>
+        <w:t xml:space="preserve">No describe estrategias específicas.</w:t>
+      </w:r>
+    </w:p>
+    <w:p>
+      <w:pPr>
+        <w:spacing w:after="240" w:before="240" w:lineRule="auto"/>
+        <w:rPr/>
+      </w:pPr>
+      <w:r>
+        <w:rPr>
+          <w:rtl w:val="0"/>
+        </w:rPr>
+        <w:t xml:space="preserve">Describe </w:t>
+      </w:r>
+      <w:r>
+        <w:rPr>
+          <w:b w:val="1"/>
+          <w:bCs w:val="1"/>
+          <w:rtl w:val="0"/>
+        </w:rPr>
+        <w:t xml:space="preserve">cómo el sistema debe pensar</w:t>
+      </w:r>
+      <w:r>
+        <w:rPr>
+          <w:rtl w:val="0"/>
+        </w:rPr>
+        <w:t xml:space="preserve">.</w:t>
+      </w:r>
+    </w:p>
+    <w:p>
+      <w:pPr>
+        <w:spacing w:after="240" w:before="240" w:lineRule="auto"/>
+        <w:rPr/>
+      </w:pPr>
+      <w:r>
+        <w:rPr>
+          <w:rtl w:val="0"/>
+        </w:rPr>
+        <w:t xml:space="preserve">Las estrategias futuras deberán respetar esta filosofía.</w:t>
       </w:r>
     </w:p>
     <w:p>
@@ -120,7 +197,7 @@
           <w:szCs w:val="46"/>
         </w:rPr>
       </w:pPr>
-      <w:bookmarkStart w:colFirst="0" w:colLast="0" w:name="_kxzf1zhvngjs" w:id="3"/>
+      <w:bookmarkStart w:colFirst="0" w:colLast="0" w:name="_tbau20gg0cyy" w:id="3"/>
       <w:bookmarkEnd w:id="3"/>
       <w:r>
         <w:rPr>
@@ -130,69 +207,72 @@
           <w:szCs w:val="46"/>
           <w:rtl w:val="0"/>
         </w:rPr>
-        <w:t xml:space="preserve">1. Propósito</w:t>
-      </w:r>
-    </w:p>
-    <w:p>
-      <w:pPr>
-        <w:spacing w:after="240" w:before="240" w:lineRule="auto"/>
-        <w:rPr/>
-      </w:pPr>
-      <w:r>
-        <w:rPr>
-          <w:rtl w:val="0"/>
-        </w:rPr>
-        <w:t xml:space="preserve">Este documento define la filosofía bajo la cual el sistema evaluará oportunidades de inversión.</w:t>
-      </w:r>
-    </w:p>
-    <w:p>
-      <w:pPr>
-        <w:spacing w:after="240" w:before="240" w:lineRule="auto"/>
-        <w:rPr/>
-      </w:pPr>
-      <w:r>
-        <w:rPr>
-          <w:rtl w:val="0"/>
-        </w:rPr>
-        <w:t xml:space="preserve">No describe estrategias específicas.</w:t>
-      </w:r>
-    </w:p>
-    <w:p>
-      <w:pPr>
-        <w:spacing w:after="240" w:before="240" w:lineRule="auto"/>
-        <w:rPr/>
-      </w:pPr>
-      <w:r>
-        <w:rPr>
-          <w:rtl w:val="0"/>
-        </w:rPr>
-        <w:t xml:space="preserve">Describe </w:t>
-      </w:r>
-      <w:r>
-        <w:rPr>
-          <w:b w:val="1"/>
-          <w:bCs w:val="1"/>
-          <w:rtl w:val="0"/>
-        </w:rPr>
-        <w:t xml:space="preserve">cómo el sistema debe pensar</w:t>
-      </w:r>
-      <w:r>
-        <w:rPr>
-          <w:rtl w:val="0"/>
-        </w:rPr>
-        <w:t xml:space="preserve">.</w:t>
-      </w:r>
-    </w:p>
-    <w:p>
-      <w:pPr>
-        <w:spacing w:after="240" w:before="240" w:lineRule="auto"/>
-        <w:rPr/>
-      </w:pPr>
-      <w:r>
-        <w:rPr>
-          <w:rtl w:val="0"/>
-        </w:rPr>
-        <w:t xml:space="preserve">Las estrategias futuras deberán respetar esta filosofía.</w:t>
+        <w:t xml:space="preserve">2. Filosofía General</w:t>
+      </w:r>
+    </w:p>
+    <w:p>
+      <w:pPr>
+        <w:spacing w:after="240" w:before="240" w:lineRule="auto"/>
+        <w:rPr/>
+      </w:pPr>
+      <w:r>
+        <w:rPr>
+          <w:rtl w:val="0"/>
+        </w:rPr>
+        <w:t xml:space="preserve">El mercado financiero es un sistema complejo, dinámico e incierto.</w:t>
+      </w:r>
+    </w:p>
+    <w:p>
+      <w:pPr>
+        <w:spacing w:after="240" w:before="240" w:lineRule="auto"/>
+        <w:rPr/>
+      </w:pPr>
+      <w:r>
+        <w:rPr>
+          <w:rtl w:val="0"/>
+        </w:rPr>
+        <w:t xml:space="preserve">Por lo tanto:</w:t>
+      </w:r>
+    </w:p>
+    <w:p>
+      <w:pPr>
+        <w:spacing w:after="240" w:before="240" w:lineRule="auto"/>
+        <w:rPr>
+          <w:b w:val="1"/>
+          <w:bCs w:val="1"/>
+        </w:rPr>
+      </w:pPr>
+      <w:r>
+        <w:rPr>
+          <w:b w:val="1"/>
+          <w:bCs w:val="1"/>
+          <w:rtl w:val="0"/>
+        </w:rPr>
+        <w:t xml:space="preserve">El sistema nunca asumirá que puede predecir el futuro con certeza.</w:t>
+      </w:r>
+    </w:p>
+    <w:p>
+      <w:pPr>
+        <w:spacing w:after="240" w:before="240" w:lineRule="auto"/>
+        <w:rPr/>
+      </w:pPr>
+      <w:r>
+        <w:rPr>
+          <w:rtl w:val="0"/>
+        </w:rPr>
+        <w:t xml:space="preserve">En cambio,</w:t>
+      </w:r>
+    </w:p>
+    <w:p>
+      <w:pPr>
+        <w:spacing w:after="240" w:before="240" w:lineRule="auto"/>
+        <w:rPr/>
+      </w:pPr>
+      <w:r>
+        <w:rPr>
+          <w:rtl w:val="0"/>
+        </w:rPr>
+        <w:t xml:space="preserve">intentará estimar probabilidades utilizando evidencia objetiva.</w:t>
       </w:r>
     </w:p>
     <w:p>
@@ -223,7 +303,7 @@
           <w:szCs w:val="46"/>
         </w:rPr>
       </w:pPr>
-      <w:bookmarkStart w:colFirst="0" w:colLast="0" w:name="_tbau20gg0cyy" w:id="4"/>
+      <w:bookmarkStart w:colFirst="0" w:colLast="0" w:name="_cp76sopqc8ir" w:id="4"/>
       <w:bookmarkEnd w:id="4"/>
       <w:r>
         <w:rPr>
@@ -233,72 +313,37 @@
           <w:szCs w:val="46"/>
           <w:rtl w:val="0"/>
         </w:rPr>
-        <w:t xml:space="preserve">2. Filosofía General</w:t>
-      </w:r>
-    </w:p>
-    <w:p>
-      <w:pPr>
-        <w:spacing w:after="240" w:before="240" w:lineRule="auto"/>
-        <w:rPr/>
-      </w:pPr>
-      <w:r>
-        <w:rPr>
-          <w:rtl w:val="0"/>
-        </w:rPr>
-        <w:t xml:space="preserve">El mercado financiero es un sistema complejo, dinámico e incierto.</w:t>
-      </w:r>
-    </w:p>
-    <w:p>
-      <w:pPr>
-        <w:spacing w:after="240" w:before="240" w:lineRule="auto"/>
-        <w:rPr/>
-      </w:pPr>
-      <w:r>
-        <w:rPr>
-          <w:rtl w:val="0"/>
-        </w:rPr>
-        <w:t xml:space="preserve">Por lo tanto:</w:t>
-      </w:r>
-    </w:p>
-    <w:p>
-      <w:pPr>
-        <w:spacing w:after="240" w:before="240" w:lineRule="auto"/>
-        <w:rPr>
-          <w:b w:val="1"/>
-          <w:bCs w:val="1"/>
-        </w:rPr>
-      </w:pPr>
-      <w:r>
-        <w:rPr>
-          <w:b w:val="1"/>
-          <w:bCs w:val="1"/>
-          <w:rtl w:val="0"/>
-        </w:rPr>
-        <w:t xml:space="preserve">El sistema nunca asumirá que puede predecir el futuro con certeza.</w:t>
-      </w:r>
-    </w:p>
-    <w:p>
-      <w:pPr>
-        <w:spacing w:after="240" w:before="240" w:lineRule="auto"/>
-        <w:rPr/>
-      </w:pPr>
-      <w:r>
-        <w:rPr>
-          <w:rtl w:val="0"/>
-        </w:rPr>
-        <w:t xml:space="preserve">En cambio,</w:t>
-      </w:r>
-    </w:p>
-    <w:p>
-      <w:pPr>
-        <w:spacing w:after="240" w:before="240" w:lineRule="auto"/>
-        <w:rPr/>
-      </w:pPr>
-      <w:r>
-        <w:rPr>
-          <w:rtl w:val="0"/>
-        </w:rPr>
-        <w:t xml:space="preserve">intentará estimar probabilidades utilizando evidencia objetiva.</w:t>
+        <w:t xml:space="preserve">3. Principio Fundamental</w:t>
+      </w:r>
+    </w:p>
+    <w:p>
+      <w:pPr>
+        <w:spacing w:after="240" w:before="240" w:lineRule="auto"/>
+        <w:ind w:left="600" w:right="600" w:firstLine="0"/>
+        <w:rPr>
+          <w:b w:val="1"/>
+          <w:bCs w:val="1"/>
+        </w:rPr>
+      </w:pPr>
+      <w:r>
+        <w:rPr>
+          <w:b w:val="1"/>
+          <w:bCs w:val="1"/>
+          <w:rtl w:val="0"/>
+        </w:rPr>
+        <w:t xml:space="preserve">El sistema no intenta adivinar el mercado. Intenta tomar decisiones con esperanza matemática positiva bajo incertidumbre controlada.</w:t>
+      </w:r>
+    </w:p>
+    <w:p>
+      <w:pPr>
+        <w:spacing w:after="240" w:before="240" w:lineRule="auto"/>
+        <w:rPr/>
+      </w:pPr>
+      <w:r>
+        <w:rPr>
+          <w:rtl w:val="0"/>
+        </w:rPr>
+        <w:t xml:space="preserve">Esta será probablemente la frase más importante de todo el proyecto.</w:t>
       </w:r>
     </w:p>
     <w:p>
@@ -329,7 +374,7 @@
           <w:szCs w:val="46"/>
         </w:rPr>
       </w:pPr>
-      <w:bookmarkStart w:colFirst="0" w:colLast="0" w:name="_cp76sopqc8ir" w:id="5"/>
+      <w:bookmarkStart w:colFirst="0" w:colLast="0" w:name="_8d1zvzh417aw" w:id="5"/>
       <w:bookmarkEnd w:id="5"/>
       <w:r>
         <w:rPr>
@@ -339,37 +384,93 @@
           <w:szCs w:val="46"/>
           <w:rtl w:val="0"/>
         </w:rPr>
-        <w:t xml:space="preserve">3. Principio Fundamental</w:t>
+        <w:t xml:space="preserve">4. Filosofía de decisión</w:t>
+      </w:r>
+    </w:p>
+    <w:p>
+      <w:pPr>
+        <w:spacing w:after="240" w:before="240" w:lineRule="auto"/>
+        <w:rPr/>
+      </w:pPr>
+      <w:r>
+        <w:rPr>
+          <w:rtl w:val="0"/>
+        </w:rPr>
+        <w:t xml:space="preserve">El sistema nunca responderá:</w:t>
       </w:r>
     </w:p>
     <w:p>
       <w:pPr>
         <w:spacing w:after="240" w:before="240" w:lineRule="auto"/>
         <w:ind w:left="600" w:right="600" w:firstLine="0"/>
-        <w:rPr>
-          <w:b w:val="1"/>
-          <w:bCs w:val="1"/>
-        </w:rPr>
-      </w:pPr>
-      <w:r>
-        <w:rPr>
-          <w:b w:val="1"/>
-          <w:bCs w:val="1"/>
-          <w:rtl w:val="0"/>
-        </w:rPr>
-        <w:t xml:space="preserve">El sistema no intenta adivinar el mercado. Intenta tomar decisiones con esperanza matemática positiva bajo incertidumbre controlada.</w:t>
-      </w:r>
-    </w:p>
-    <w:p>
-      <w:pPr>
-        <w:spacing w:after="240" w:before="240" w:lineRule="auto"/>
-        <w:rPr/>
-      </w:pPr>
-      <w:r>
-        <w:rPr>
-          <w:rtl w:val="0"/>
-        </w:rPr>
-        <w:t xml:space="preserve">Esta será probablemente la frase más importante de todo el proyecto.</w:t>
+        <w:rPr/>
+      </w:pPr>
+      <w:r>
+        <w:rPr>
+          <w:rtl w:val="0"/>
+        </w:rPr>
+        <w:t xml:space="preserve">¿Subirá esta acción?</w:t>
+      </w:r>
+    </w:p>
+    <w:p>
+      <w:pPr>
+        <w:spacing w:after="240" w:before="240" w:lineRule="auto"/>
+        <w:rPr/>
+      </w:pPr>
+      <w:r>
+        <w:rPr>
+          <w:rtl w:val="0"/>
+        </w:rPr>
+        <w:t xml:space="preserve">Responderá:</w:t>
+      </w:r>
+    </w:p>
+    <w:p>
+      <w:pPr>
+        <w:spacing w:after="240" w:before="240" w:lineRule="auto"/>
+        <w:ind w:left="600" w:right="600" w:firstLine="0"/>
+        <w:rPr/>
+      </w:pPr>
+      <w:r>
+        <w:rPr>
+          <w:rtl w:val="0"/>
+        </w:rPr>
+        <w:t xml:space="preserve">Dada toda la información disponible, ¿esta inversión presenta una expectativa suficientemente favorable respecto al riesgo asumido?</w:t>
+      </w:r>
+    </w:p>
+    <w:p>
+      <w:pPr>
+        <w:spacing w:after="240" w:before="240" w:lineRule="auto"/>
+        <w:rPr/>
+      </w:pPr>
+      <w:r>
+        <w:rPr>
+          <w:rtl w:val="0"/>
+        </w:rPr>
+        <w:t xml:space="preserve">Parece una diferencia pequeña.</w:t>
+      </w:r>
+    </w:p>
+    <w:p>
+      <w:pPr>
+        <w:spacing w:after="240" w:before="240" w:lineRule="auto"/>
+        <w:rPr/>
+      </w:pPr>
+      <w:r>
+        <w:rPr>
+          <w:rtl w:val="0"/>
+        </w:rPr>
+        <w:t xml:space="preserve">No lo es.</w:t>
+      </w:r>
+    </w:p>
+    <w:p>
+      <w:pPr>
+        <w:spacing w:after="240" w:before="240" w:lineRule="auto"/>
+        <w:rPr/>
+      </w:pPr>
+      <w:r>
+        <w:rPr>
+          <w:rtl w:val="0"/>
+        </w:rPr>
+        <w:t xml:space="preserve">Cambia completamente el diseño.</w:t>
       </w:r>
     </w:p>
     <w:p>
@@ -400,7 +501,7 @@
           <w:szCs w:val="46"/>
         </w:rPr>
       </w:pPr>
-      <w:bookmarkStart w:colFirst="0" w:colLast="0" w:name="_8d1zvzh417aw" w:id="6"/>
+      <w:bookmarkStart w:colFirst="0" w:colLast="0" w:name="_kh3cza2upc7c" w:id="6"/>
       <w:bookmarkEnd w:id="6"/>
       <w:r>
         <w:rPr>
@@ -410,93 +511,67 @@
           <w:szCs w:val="46"/>
           <w:rtl w:val="0"/>
         </w:rPr>
-        <w:t xml:space="preserve">4. Filosofía de decisión</w:t>
-      </w:r>
-    </w:p>
-    <w:p>
-      <w:pPr>
-        <w:spacing w:after="240" w:before="240" w:lineRule="auto"/>
-        <w:rPr/>
-      </w:pPr>
-      <w:r>
-        <w:rPr>
-          <w:rtl w:val="0"/>
-        </w:rPr>
-        <w:t xml:space="preserve">El sistema nunca responderá:</w:t>
-      </w:r>
-    </w:p>
-    <w:p>
-      <w:pPr>
-        <w:spacing w:after="240" w:before="240" w:lineRule="auto"/>
-        <w:ind w:left="600" w:right="600" w:firstLine="0"/>
-        <w:rPr/>
-      </w:pPr>
-      <w:r>
-        <w:rPr>
-          <w:rtl w:val="0"/>
-        </w:rPr>
-        <w:t xml:space="preserve">¿Subirá esta acción?</w:t>
-      </w:r>
-    </w:p>
-    <w:p>
-      <w:pPr>
-        <w:spacing w:after="240" w:before="240" w:lineRule="auto"/>
-        <w:rPr/>
-      </w:pPr>
-      <w:r>
-        <w:rPr>
-          <w:rtl w:val="0"/>
-        </w:rPr>
-        <w:t xml:space="preserve">Responderá:</w:t>
-      </w:r>
-    </w:p>
-    <w:p>
-      <w:pPr>
-        <w:spacing w:after="240" w:before="240" w:lineRule="auto"/>
-        <w:ind w:left="600" w:right="600" w:firstLine="0"/>
-        <w:rPr/>
-      </w:pPr>
-      <w:r>
-        <w:rPr>
-          <w:rtl w:val="0"/>
-        </w:rPr>
-        <w:t xml:space="preserve">Dada toda la información disponible, ¿esta inversión presenta una expectativa suficientemente favorable respecto al riesgo asumido?</w:t>
-      </w:r>
-    </w:p>
-    <w:p>
-      <w:pPr>
-        <w:spacing w:after="240" w:before="240" w:lineRule="auto"/>
-        <w:rPr/>
-      </w:pPr>
-      <w:r>
-        <w:rPr>
-          <w:rtl w:val="0"/>
-        </w:rPr>
-        <w:t xml:space="preserve">Parece una diferencia pequeña.</w:t>
-      </w:r>
-    </w:p>
-    <w:p>
-      <w:pPr>
-        <w:spacing w:after="240" w:before="240" w:lineRule="auto"/>
-        <w:rPr/>
-      </w:pPr>
-      <w:r>
-        <w:rPr>
-          <w:rtl w:val="0"/>
-        </w:rPr>
-        <w:t xml:space="preserve">No lo es.</w:t>
-      </w:r>
-    </w:p>
-    <w:p>
-      <w:pPr>
-        <w:spacing w:after="240" w:before="240" w:lineRule="auto"/>
-        <w:rPr/>
-      </w:pPr>
-      <w:r>
-        <w:rPr>
-          <w:rtl w:val="0"/>
-        </w:rPr>
-        <w:t xml:space="preserve">Cambia completamente el diseño.</w:t>
+        <w:t xml:space="preserve">5. El mercado nunca tiene una única verdad</w:t>
+      </w:r>
+    </w:p>
+    <w:p>
+      <w:pPr>
+        <w:spacing w:after="240" w:before="240" w:lineRule="auto"/>
+        <w:rPr/>
+      </w:pPr>
+      <w:r>
+        <w:rPr>
+          <w:rtl w:val="0"/>
+        </w:rPr>
+        <w:t xml:space="preserve">Dos estrategias diferentes pueden ser correctas.</w:t>
+      </w:r>
+    </w:p>
+    <w:p>
+      <w:pPr>
+        <w:spacing w:after="240" w:before="240" w:lineRule="auto"/>
+        <w:rPr/>
+      </w:pPr>
+      <w:r>
+        <w:rPr>
+          <w:rtl w:val="0"/>
+        </w:rPr>
+        <w:t xml:space="preserve">Dos estrategias pueden ganar dinero.</w:t>
+      </w:r>
+    </w:p>
+    <w:p>
+      <w:pPr>
+        <w:spacing w:after="240" w:before="240" w:lineRule="auto"/>
+        <w:rPr/>
+      </w:pPr>
+      <w:r>
+        <w:rPr>
+          <w:rtl w:val="0"/>
+        </w:rPr>
+        <w:t xml:space="preserve">Dos estrategias pueden perder dinero.</w:t>
+      </w:r>
+    </w:p>
+    <w:p>
+      <w:pPr>
+        <w:spacing w:after="240" w:before="240" w:lineRule="auto"/>
+        <w:rPr/>
+      </w:pPr>
+      <w:r>
+        <w:rPr>
+          <w:rtl w:val="0"/>
+        </w:rPr>
+        <w:t xml:space="preserve">El sistema nunca descartará una estrategia únicamente porque otra haya obtenido mayor rentabilidad en un período determinado.</w:t>
+      </w:r>
+    </w:p>
+    <w:p>
+      <w:pPr>
+        <w:spacing w:after="240" w:before="240" w:lineRule="auto"/>
+        <w:rPr/>
+      </w:pPr>
+      <w:r>
+        <w:rPr>
+          <w:rtl w:val="0"/>
+        </w:rPr>
+        <w:t xml:space="preserve">Toda estrategia será evaluada dentro de su contexto.</w:t>
       </w:r>
     </w:p>
     <w:p>
@@ -527,7 +602,7 @@
           <w:szCs w:val="46"/>
         </w:rPr>
       </w:pPr>
-      <w:bookmarkStart w:colFirst="0" w:colLast="0" w:name="_kh3cza2upc7c" w:id="7"/>
+      <w:bookmarkStart w:colFirst="0" w:colLast="0" w:name="_p34s2phjrfca" w:id="7"/>
       <w:bookmarkEnd w:id="7"/>
       <w:r>
         <w:rPr>
@@ -537,67 +612,68 @@
           <w:szCs w:val="46"/>
           <w:rtl w:val="0"/>
         </w:rPr>
-        <w:t xml:space="preserve">5. El mercado nunca tiene una única verdad</w:t>
-      </w:r>
-    </w:p>
-    <w:p>
-      <w:pPr>
-        <w:spacing w:after="240" w:before="240" w:lineRule="auto"/>
-        <w:rPr/>
-      </w:pPr>
-      <w:r>
-        <w:rPr>
-          <w:rtl w:val="0"/>
-        </w:rPr>
-        <w:t xml:space="preserve">Dos estrategias diferentes pueden ser correctas.</w:t>
-      </w:r>
-    </w:p>
-    <w:p>
-      <w:pPr>
-        <w:spacing w:after="240" w:before="240" w:lineRule="auto"/>
-        <w:rPr/>
-      </w:pPr>
-      <w:r>
-        <w:rPr>
-          <w:rtl w:val="0"/>
-        </w:rPr>
-        <w:t xml:space="preserve">Dos estrategias pueden ganar dinero.</w:t>
-      </w:r>
-    </w:p>
-    <w:p>
-      <w:pPr>
-        <w:spacing w:after="240" w:before="240" w:lineRule="auto"/>
-        <w:rPr/>
-      </w:pPr>
-      <w:r>
-        <w:rPr>
-          <w:rtl w:val="0"/>
-        </w:rPr>
-        <w:t xml:space="preserve">Dos estrategias pueden perder dinero.</w:t>
-      </w:r>
-    </w:p>
-    <w:p>
-      <w:pPr>
-        <w:spacing w:after="240" w:before="240" w:lineRule="auto"/>
-        <w:rPr/>
-      </w:pPr>
-      <w:r>
-        <w:rPr>
-          <w:rtl w:val="0"/>
-        </w:rPr>
-        <w:t xml:space="preserve">El sistema nunca descartará una estrategia únicamente porque otra haya obtenido mayor rentabilidad en un período determinado.</w:t>
-      </w:r>
-    </w:p>
-    <w:p>
-      <w:pPr>
-        <w:spacing w:after="240" w:before="240" w:lineRule="auto"/>
-        <w:rPr/>
-      </w:pPr>
-      <w:r>
-        <w:rPr>
-          <w:rtl w:val="0"/>
-        </w:rPr>
-        <w:t xml:space="preserve">Toda estrategia será evaluada dentro de su contexto.</w:t>
+        <w:t xml:space="preserve">6. El objetivo nunca será acertar</w:t>
+      </w:r>
+    </w:p>
+    <w:p>
+      <w:pPr>
+        <w:spacing w:after="240" w:before="240" w:lineRule="auto"/>
+        <w:rPr/>
+      </w:pPr>
+      <w:r>
+        <w:rPr>
+          <w:rtl w:val="0"/>
+        </w:rPr>
+        <w:t xml:space="preserve">Uno de los mayores errores del trading consiste en intentar tener razón.</w:t>
+      </w:r>
+    </w:p>
+    <w:p>
+      <w:pPr>
+        <w:spacing w:after="240" w:before="240" w:lineRule="auto"/>
+        <w:rPr/>
+      </w:pPr>
+      <w:r>
+        <w:rPr>
+          <w:rtl w:val="0"/>
+        </w:rPr>
+        <w:t xml:space="preserve">El objetivo del sistema NO es tener razón.</w:t>
+      </w:r>
+    </w:p>
+    <w:p>
+      <w:pPr>
+        <w:spacing w:after="240" w:before="240" w:lineRule="auto"/>
+        <w:rPr/>
+      </w:pPr>
+      <w:r>
+        <w:rPr>
+          <w:rtl w:val="0"/>
+        </w:rPr>
+        <w:t xml:space="preserve">El objetivo es:</w:t>
+      </w:r>
+    </w:p>
+    <w:p>
+      <w:pPr>
+        <w:spacing w:after="240" w:before="240" w:lineRule="auto"/>
+        <w:ind w:left="600" w:right="600" w:firstLine="0"/>
+        <w:rPr/>
+      </w:pPr>
+      <w:r>
+        <w:rPr>
+          <w:rtl w:val="0"/>
+        </w:rPr>
+        <w:t xml:space="preserve">Maximizar el crecimiento compuesto esperado del capital a largo plazo.</w:t>
+      </w:r>
+    </w:p>
+    <w:p>
+      <w:pPr>
+        <w:spacing w:after="240" w:before="240" w:lineRule="auto"/>
+        <w:rPr/>
+      </w:pPr>
+      <w:r>
+        <w:rPr>
+          <w:rtl w:val="0"/>
+        </w:rPr>
+        <w:t xml:space="preserve">Esto significa que el sistema aceptará perder operaciones individuales si la expectativa global continúa siendo positiva.</w:t>
       </w:r>
     </w:p>
     <w:p>
@@ -628,110 +704,8 @@
           <w:szCs w:val="46"/>
         </w:rPr>
       </w:pPr>
-      <w:bookmarkStart w:colFirst="0" w:colLast="0" w:name="_p34s2phjrfca" w:id="8"/>
+      <w:bookmarkStart w:colFirst="0" w:colLast="0" w:name="_ve97p4megx0s" w:id="8"/>
       <w:bookmarkEnd w:id="8"/>
-      <w:r>
-        <w:rPr>
-          <w:b w:val="1"/>
-          <w:bCs w:val="1"/>
-          <w:sz w:val="46"/>
-          <w:szCs w:val="46"/>
-          <w:rtl w:val="0"/>
-        </w:rPr>
-        <w:t xml:space="preserve">6. El objetivo nunca será acertar</w:t>
-      </w:r>
-    </w:p>
-    <w:p>
-      <w:pPr>
-        <w:spacing w:after="240" w:before="240" w:lineRule="auto"/>
-        <w:rPr/>
-      </w:pPr>
-      <w:r>
-        <w:rPr>
-          <w:rtl w:val="0"/>
-        </w:rPr>
-        <w:t xml:space="preserve">Uno de los mayores errores del trading consiste en intentar tener razón.</w:t>
-      </w:r>
-    </w:p>
-    <w:p>
-      <w:pPr>
-        <w:spacing w:after="240" w:before="240" w:lineRule="auto"/>
-        <w:rPr/>
-      </w:pPr>
-      <w:r>
-        <w:rPr>
-          <w:rtl w:val="0"/>
-        </w:rPr>
-        <w:t xml:space="preserve">El objetivo del sistema NO es tener razón.</w:t>
-      </w:r>
-    </w:p>
-    <w:p>
-      <w:pPr>
-        <w:spacing w:after="240" w:before="240" w:lineRule="auto"/>
-        <w:rPr/>
-      </w:pPr>
-      <w:r>
-        <w:rPr>
-          <w:rtl w:val="0"/>
-        </w:rPr>
-        <w:t xml:space="preserve">El objetivo es:</w:t>
-      </w:r>
-    </w:p>
-    <w:p>
-      <w:pPr>
-        <w:spacing w:after="240" w:before="240" w:lineRule="auto"/>
-        <w:ind w:left="600" w:right="600" w:firstLine="0"/>
-        <w:rPr/>
-      </w:pPr>
-      <w:r>
-        <w:rPr>
-          <w:rtl w:val="0"/>
-        </w:rPr>
-        <w:t xml:space="preserve">Maximizar el crecimiento compuesto esperado del capital a largo plazo.</w:t>
-      </w:r>
-    </w:p>
-    <w:p>
-      <w:pPr>
-        <w:spacing w:after="240" w:before="240" w:lineRule="auto"/>
-        <w:rPr/>
-      </w:pPr>
-      <w:r>
-        <w:rPr>
-          <w:rtl w:val="0"/>
-        </w:rPr>
-        <w:t xml:space="preserve">Esto significa que el sistema aceptará perder operaciones individuales si la expectativa global continúa siendo positiva.</w:t>
-      </w:r>
-    </w:p>
-    <w:p>
-      <w:pPr>
-        <w:rPr/>
-      </w:pPr>
-      <w:r>
-        <w:pict>
-          <v:rect style="width:0.0pt;height:1.5pt" o:hr="t" o:hrstd="t" o:hralign="center" fillcolor="#A0A0A0" stroked="f"/>
-        </w:pict>
-      </w:r>
-      <w:r>
-        <w:rPr>
-          <w:rtl w:val="0"/>
-        </w:rPr>
-      </w:r>
-    </w:p>
-    <w:p>
-      <w:pPr>
-        <w:pStyle w:val="Heading1"/>
-        <w:keepNext w:val="0"/>
-        <w:keepLines w:val="0"/>
-        <w:spacing w:before="480" w:lineRule="auto"/>
-        <w:rPr>
-          <w:b w:val="1"/>
-          <w:bCs w:val="1"/>
-          <w:sz w:val="46"/>
-          <w:szCs w:val="46"/>
-        </w:rPr>
-      </w:pPr>
-      <w:bookmarkStart w:colFirst="0" w:colLast="0" w:name="_ve97p4megx0s" w:id="9"/>
-      <w:bookmarkEnd w:id="9"/>
       <w:r>
         <w:rPr>
           <w:b w:val="1"/>
@@ -867,8 +841,8 @@
           <w:szCs w:val="46"/>
         </w:rPr>
       </w:pPr>
-      <w:bookmarkStart w:colFirst="0" w:colLast="0" w:name="_f1i0vrgkrgwz" w:id="10"/>
-      <w:bookmarkEnd w:id="10"/>
+      <w:bookmarkStart w:colFirst="0" w:colLast="0" w:name="_f1i0vrgkrgwz" w:id="9"/>
+      <w:bookmarkEnd w:id="9"/>
       <w:r>
         <w:rPr>
           <w:b w:val="1"/>
@@ -968,8 +942,8 @@
           <w:szCs w:val="46"/>
         </w:rPr>
       </w:pPr>
-      <w:bookmarkStart w:colFirst="0" w:colLast="0" w:name="_d66tmiat5ton" w:id="11"/>
-      <w:bookmarkEnd w:id="11"/>
+      <w:bookmarkStart w:colFirst="0" w:colLast="0" w:name="_d66tmiat5ton" w:id="10"/>
+      <w:bookmarkEnd w:id="10"/>
       <w:r>
         <w:rPr>
           <w:b w:val="1"/>
@@ -1057,8 +1031,8 @@
           <w:szCs w:val="46"/>
         </w:rPr>
       </w:pPr>
-      <w:bookmarkStart w:colFirst="0" w:colLast="0" w:name="_mlzmh1pwqpvk" w:id="12"/>
-      <w:bookmarkEnd w:id="12"/>
+      <w:bookmarkStart w:colFirst="0" w:colLast="0" w:name="_mlzmh1pwqpvk" w:id="11"/>
+      <w:bookmarkEnd w:id="11"/>
       <w:r>
         <w:rPr>
           <w:b w:val="1"/>
@@ -1182,8 +1156,8 @@
           <w:szCs w:val="46"/>
         </w:rPr>
       </w:pPr>
-      <w:bookmarkStart w:colFirst="0" w:colLast="0" w:name="_5ue4727blfm" w:id="13"/>
-      <w:bookmarkEnd w:id="13"/>
+      <w:bookmarkStart w:colFirst="0" w:colLast="0" w:name="_5ue4727blfm" w:id="12"/>
+      <w:bookmarkEnd w:id="12"/>
       <w:r>
         <w:rPr>
           <w:b w:val="1"/>
@@ -1307,8 +1281,8 @@
           <w:szCs w:val="46"/>
         </w:rPr>
       </w:pPr>
-      <w:bookmarkStart w:colFirst="0" w:colLast="0" w:name="_dagp39pcuiqh" w:id="14"/>
-      <w:bookmarkEnd w:id="14"/>
+      <w:bookmarkStart w:colFirst="0" w:colLast="0" w:name="_dagp39pcuiqh" w:id="13"/>
+      <w:bookmarkEnd w:id="13"/>
       <w:r>
         <w:rPr>
           <w:b w:val="1"/>
@@ -1408,8 +1382,8 @@
           <w:szCs w:val="46"/>
         </w:rPr>
       </w:pPr>
-      <w:bookmarkStart w:colFirst="0" w:colLast="0" w:name="_5txkhpvt05e2" w:id="15"/>
-      <w:bookmarkEnd w:id="15"/>
+      <w:bookmarkStart w:colFirst="0" w:colLast="0" w:name="_5txkhpvt05e2" w:id="14"/>
+      <w:bookmarkEnd w:id="14"/>
       <w:r>
         <w:rPr>
           <w:b w:val="1"/>
@@ -1485,8 +1459,8 @@
           <w:szCs w:val="46"/>
         </w:rPr>
       </w:pPr>
-      <w:bookmarkStart w:colFirst="0" w:colLast="0" w:name="_x2uvyrpyakge" w:id="16"/>
-      <w:bookmarkEnd w:id="16"/>
+      <w:bookmarkStart w:colFirst="0" w:colLast="0" w:name="_x2uvyrpyakge" w:id="15"/>
+      <w:bookmarkEnd w:id="15"/>
       <w:r>
         <w:rPr>
           <w:b w:val="1"/>
@@ -1622,8 +1596,8 @@
           <w:szCs w:val="46"/>
         </w:rPr>
       </w:pPr>
-      <w:bookmarkStart w:colFirst="0" w:colLast="0" w:name="_t444qthtgkps" w:id="17"/>
-      <w:bookmarkEnd w:id="17"/>
+      <w:bookmarkStart w:colFirst="0" w:colLast="0" w:name="_t444qthtgkps" w:id="16"/>
+      <w:bookmarkEnd w:id="16"/>
       <w:r>
         <w:rPr>
           <w:b w:val="1"/>
@@ -1699,8 +1673,8 @@
           <w:szCs w:val="46"/>
         </w:rPr>
       </w:pPr>
-      <w:bookmarkStart w:colFirst="0" w:colLast="0" w:name="_x77hhs4isa95" w:id="18"/>
-      <w:bookmarkEnd w:id="18"/>
+      <w:bookmarkStart w:colFirst="0" w:colLast="0" w:name="_x77hhs4isa95" w:id="17"/>
+      <w:bookmarkEnd w:id="17"/>
       <w:r>
         <w:rPr>
           <w:b w:val="1"/>
@@ -1840,8 +1814,8 @@
           <w:szCs w:val="46"/>
         </w:rPr>
       </w:pPr>
-      <w:bookmarkStart w:colFirst="0" w:colLast="0" w:name="_576zej5h3x9z" w:id="19"/>
-      <w:bookmarkEnd w:id="19"/>
+      <w:bookmarkStart w:colFirst="0" w:colLast="0" w:name="_576zej5h3x9z" w:id="18"/>
+      <w:bookmarkEnd w:id="18"/>
       <w:r>
         <w:rPr>
           <w:b w:val="1"/>
@@ -1929,8 +1903,8 @@
           <w:szCs w:val="46"/>
         </w:rPr>
       </w:pPr>
-      <w:bookmarkStart w:colFirst="0" w:colLast="0" w:name="_yv34kiiussmr" w:id="20"/>
-      <w:bookmarkEnd w:id="20"/>
+      <w:bookmarkStart w:colFirst="0" w:colLast="0" w:name="_yv34kiiussmr" w:id="19"/>
+      <w:bookmarkEnd w:id="19"/>
       <w:r>
         <w:rPr>
           <w:b w:val="1"/>
@@ -2098,8 +2072,8 @@
           <w:szCs w:val="46"/>
         </w:rPr>
       </w:pPr>
-      <w:bookmarkStart w:colFirst="0" w:colLast="0" w:name="_233kc56f1yxm" w:id="21"/>
-      <w:bookmarkEnd w:id="21"/>
+      <w:bookmarkStart w:colFirst="0" w:colLast="0" w:name="_233kc56f1yxm" w:id="20"/>
+      <w:bookmarkEnd w:id="20"/>
       <w:r>
         <w:rPr>
           <w:b w:val="1"/>
@@ -2374,8 +2348,8 @@
           <w:szCs w:val="46"/>
         </w:rPr>
       </w:pPr>
-      <w:bookmarkStart w:colFirst="0" w:colLast="0" w:name="_1dyhhhutv75b" w:id="22"/>
-      <w:bookmarkEnd w:id="22"/>
+      <w:bookmarkStart w:colFirst="0" w:colLast="0" w:name="_1dyhhhutv75b" w:id="21"/>
+      <w:bookmarkEnd w:id="21"/>
       <w:r>
         <w:rPr>
           <w:b w:val="1"/>
@@ -2531,8 +2505,8 @@
           <w:szCs w:val="46"/>
         </w:rPr>
       </w:pPr>
-      <w:bookmarkStart w:colFirst="0" w:colLast="0" w:name="_79e6mwwpk61q" w:id="23"/>
-      <w:bookmarkEnd w:id="23"/>
+      <w:bookmarkStart w:colFirst="0" w:colLast="0" w:name="_79e6mwwpk61q" w:id="22"/>
+      <w:bookmarkEnd w:id="22"/>
       <w:r>
         <w:rPr>
           <w:b w:val="1"/>
@@ -2676,8 +2650,8 @@
           <w:szCs w:val="46"/>
         </w:rPr>
       </w:pPr>
-      <w:bookmarkStart w:colFirst="0" w:colLast="0" w:name="_4wjsnly5ra9x" w:id="24"/>
-      <w:bookmarkEnd w:id="24"/>
+      <w:bookmarkStart w:colFirst="0" w:colLast="0" w:name="_4wjsnly5ra9x" w:id="23"/>
+      <w:bookmarkEnd w:id="23"/>
       <w:r>
         <w:rPr>
           <w:b w:val="1"/>
@@ -2789,8 +2763,8 @@
           <w:szCs w:val="46"/>
         </w:rPr>
       </w:pPr>
-      <w:bookmarkStart w:colFirst="0" w:colLast="0" w:name="_max0xghg7vzu" w:id="25"/>
-      <w:bookmarkEnd w:id="25"/>
+      <w:bookmarkStart w:colFirst="0" w:colLast="0" w:name="_max0xghg7vzu" w:id="24"/>
+      <w:bookmarkEnd w:id="24"/>
       <w:r>
         <w:rPr>
           <w:b w:val="1"/>
@@ -2866,8 +2840,8 @@
           <w:szCs w:val="46"/>
         </w:rPr>
       </w:pPr>
-      <w:bookmarkStart w:colFirst="0" w:colLast="0" w:name="_opyhoovddrpo" w:id="26"/>
-      <w:bookmarkEnd w:id="26"/>
+      <w:bookmarkStart w:colFirst="0" w:colLast="0" w:name="_opyhoovddrpo" w:id="25"/>
+      <w:bookmarkEnd w:id="25"/>
       <w:r>
         <w:rPr>
           <w:b w:val="1"/>
@@ -3020,8 +2994,8 @@
           <w:szCs w:val="46"/>
         </w:rPr>
       </w:pPr>
-      <w:bookmarkStart w:colFirst="0" w:colLast="0" w:name="_x9zz6af6p776" w:id="27"/>
-      <w:bookmarkEnd w:id="27"/>
+      <w:bookmarkStart w:colFirst="0" w:colLast="0" w:name="_x9zz6af6p776" w:id="26"/>
+      <w:bookmarkEnd w:id="26"/>
       <w:r>
         <w:rPr>
           <w:b w:val="1"/>
@@ -3079,8 +3053,8 @@
           <w:szCs w:val="46"/>
         </w:rPr>
       </w:pPr>
-      <w:bookmarkStart w:colFirst="0" w:colLast="0" w:name="_e7pgpbi29xq" w:id="28"/>
-      <w:bookmarkEnd w:id="28"/>
+      <w:bookmarkStart w:colFirst="0" w:colLast="0" w:name="_e7pgpbi29xq" w:id="27"/>
+      <w:bookmarkEnd w:id="27"/>
       <w:r>
         <w:rPr>
           <w:b w:val="1"/>

</xml_diff>